<commit_message>
changes in docx file
</commit_message>
<xml_diff>
--- a/Document unavailable.docx
+++ b/Document unavailable.docx
@@ -15,6 +15,12 @@
         </w:rPr>
         <w:t>Investigation of the properties of structural materials using the tensile test method</w:t>
       </w:r>
+      <w:r>
+        <w:rPr>
+          <w:lang w:val="en-US"/>
+        </w:rPr>
+        <w:t xml:space="preserve"> ….</w:t>
+      </w:r>
     </w:p>
     <w:p>
       <w:pPr>
@@ -55,8 +61,16 @@
         <w:rPr>
           <w:lang w:val="en-US"/>
         </w:rPr>
-        <w:t>Objective of the exercise</w:t>
-      </w:r>
+        <w:t xml:space="preserve">Objective of </w:t>
+      </w:r>
+      <w:proofErr w:type="gramStart"/>
+      <w:r>
+        <w:rPr>
+          <w:lang w:val="en-US"/>
+        </w:rPr>
+        <w:t>the exercise</w:t>
+      </w:r>
+      <w:proofErr w:type="gramEnd"/>
     </w:p>
     <w:p>
       <w:pPr>
@@ -71,21 +85,7 @@
         <w:rPr>
           <w:lang w:val="en-US"/>
         </w:rPr>
-        <w:t xml:space="preserve">Celem </w:t>
-      </w:r>
-      <w:proofErr w:type="spellStart"/>
-      <w:r>
-        <w:rPr>
-          <w:lang w:val="en-US"/>
-        </w:rPr>
-        <w:t>ćwiczenia</w:t>
-      </w:r>
-      <w:proofErr w:type="spellEnd"/>
-      <w:r>
-        <w:rPr>
-          <w:lang w:val="en-US"/>
-        </w:rPr>
-        <w:t xml:space="preserve"> jest:</w:t>
+        <w:t>Celem ćwiczenia jest:</w:t>
       </w:r>
     </w:p>
     <w:p>
@@ -253,7 +253,21 @@
         <w:rPr>
           <w:lang w:val="en-US"/>
         </w:rPr>
-        <w:t xml:space="preserve">assess the behavior of the material under loading. </w:t>
+        <w:t xml:space="preserve">assess the behavior of the material </w:t>
+      </w:r>
+      <w:proofErr w:type="gramStart"/>
+      <w:r>
+        <w:rPr>
+          <w:lang w:val="en-US"/>
+        </w:rPr>
+        <w:t>under loading</w:t>
+      </w:r>
+      <w:proofErr w:type="gramEnd"/>
+      <w:r>
+        <w:rPr>
+          <w:lang w:val="en-US"/>
+        </w:rPr>
+        <w:t xml:space="preserve">. </w:t>
       </w:r>
     </w:p>
     <w:p>
@@ -304,7 +318,23 @@
           <w:color w:val="auto"/>
           <w:lang w:val="en-US"/>
         </w:rPr>
-        <w:t>Equipment of the test station</w:t>
+        <w:t xml:space="preserve">Equipment </w:t>
+      </w:r>
+      <w:proofErr w:type="gramStart"/>
+      <w:r>
+        <w:rPr>
+          <w:color w:val="auto"/>
+          <w:lang w:val="en-US"/>
+        </w:rPr>
+        <w:t>of</w:t>
+      </w:r>
+      <w:proofErr w:type="gramEnd"/>
+      <w:r>
+        <w:rPr>
+          <w:color w:val="auto"/>
+          <w:lang w:val="en-US"/>
+        </w:rPr>
+        <w:t xml:space="preserve"> the test station</w:t>
       </w:r>
     </w:p>
     <w:p>
@@ -357,21 +387,12 @@
                 <w:bCs/>
               </w:rPr>
             </w:pPr>
-            <w:proofErr w:type="spellStart"/>
             <w:r>
               <w:rPr>
                 <w:b/>
                 <w:bCs/>
               </w:rPr>
-              <w:t>Equipment</w:t>
-            </w:r>
-            <w:proofErr w:type="spellEnd"/>
-            <w:r>
-              <w:rPr>
-                <w:b/>
-                <w:bCs/>
-              </w:rPr>
-              <w:t xml:space="preserve"> element</w:t>
+              <w:t>Equipment element</w:t>
             </w:r>
           </w:p>
         </w:tc>
@@ -403,21 +424,8 @@
           </w:tcPr>
           <w:p>
             <w:r>
-              <w:t xml:space="preserve">Universal </w:t>
+              <w:t>Universal testing machine</w:t>
             </w:r>
-            <w:proofErr w:type="spellStart"/>
-            <w:r>
-              <w:t>testing</w:t>
-            </w:r>
-            <w:proofErr w:type="spellEnd"/>
-            <w:r>
-              <w:t xml:space="preserve"> </w:t>
-            </w:r>
-            <w:proofErr w:type="spellStart"/>
-            <w:r>
-              <w:t>machine</w:t>
-            </w:r>
-            <w:proofErr w:type="spellEnd"/>
           </w:p>
         </w:tc>
         <w:tc>
@@ -445,63 +453,8 @@
             <w:tcW w:w="4531" w:type="dxa"/>
           </w:tcPr>
           <w:p>
-            <w:proofErr w:type="spellStart"/>
             <w:r>
-              <w:t>Vernier</w:t>
-            </w:r>
-            <w:proofErr w:type="spellEnd"/>
-            <w:r>
-              <w:t xml:space="preserve"> </w:t>
-            </w:r>
-            <w:proofErr w:type="spellStart"/>
-            <w:r>
-              <w:t>caliper</w:t>
-            </w:r>
-            <w:proofErr w:type="spellEnd"/>
-          </w:p>
-        </w:tc>
-        <w:tc>
-          <w:tcPr>
-            <w:tcW w:w="4531" w:type="dxa"/>
-          </w:tcPr>
-          <w:p>
-            <w:proofErr w:type="spellStart"/>
-            <w:r>
-              <w:t>measurement</w:t>
-            </w:r>
-            <w:proofErr w:type="spellEnd"/>
-            <w:r>
-              <w:t xml:space="preserve"> of </w:t>
-            </w:r>
-            <w:proofErr w:type="spellStart"/>
-            <w:r>
-              <w:t>specimen</w:t>
-            </w:r>
-            <w:proofErr w:type="spellEnd"/>
-            <w:r>
-              <w:t xml:space="preserve"> </w:t>
-            </w:r>
-            <w:proofErr w:type="spellStart"/>
-            <w:r>
-              <w:t>dimensions</w:t>
-            </w:r>
-            <w:proofErr w:type="spellEnd"/>
-          </w:p>
-        </w:tc>
-      </w:tr>
-      <w:tr>
-        <w:tc>
-          <w:tcPr>
-            <w:tcW w:w="4531" w:type="dxa"/>
-          </w:tcPr>
-          <w:p>
-            <w:proofErr w:type="spellStart"/>
-            <w:r>
-              <w:t>Computer</w:t>
-            </w:r>
-            <w:proofErr w:type="spellEnd"/>
-            <w:r>
-              <w:t xml:space="preserve"> with software</w:t>
+              <w:t>Vernier caliper</w:t>
             </w:r>
           </w:p>
         </w:tc>
@@ -511,13 +464,8 @@
           </w:tcPr>
           <w:p>
             <w:r>
-              <w:t xml:space="preserve">data </w:t>
+              <w:t>measurement of specimen dimensions</w:t>
             </w:r>
-            <w:proofErr w:type="spellStart"/>
-            <w:r>
-              <w:t>acquisition</w:t>
-            </w:r>
-            <w:proofErr w:type="spellEnd"/>
           </w:p>
         </w:tc>
       </w:tr>
@@ -528,21 +476,8 @@
           </w:tcPr>
           <w:p>
             <w:r>
-              <w:t xml:space="preserve">Steel and </w:t>
+              <w:t>Computer with software</w:t>
             </w:r>
-            <w:proofErr w:type="spellStart"/>
-            <w:r>
-              <w:t>aluminum</w:t>
-            </w:r>
-            <w:proofErr w:type="spellEnd"/>
-            <w:r>
-              <w:t xml:space="preserve"> </w:t>
-            </w:r>
-            <w:proofErr w:type="spellStart"/>
-            <w:r>
-              <w:t>specimens</w:t>
-            </w:r>
-            <w:proofErr w:type="spellEnd"/>
           </w:p>
         </w:tc>
         <w:tc>
@@ -551,13 +486,30 @@
           </w:tcPr>
           <w:p>
             <w:r>
-              <w:t xml:space="preserve">test </w:t>
+              <w:t>data acquisition</w:t>
             </w:r>
-            <w:proofErr w:type="spellStart"/>
+          </w:p>
+        </w:tc>
+      </w:tr>
+      <w:tr>
+        <w:tc>
+          <w:tcPr>
+            <w:tcW w:w="4531" w:type="dxa"/>
+          </w:tcPr>
+          <w:p>
             <w:r>
-              <w:t>material</w:t>
+              <w:t>Steel and aluminum specimens</w:t>
             </w:r>
-            <w:proofErr w:type="spellEnd"/>
+          </w:p>
+        </w:tc>
+        <w:tc>
+          <w:tcPr>
+            <w:tcW w:w="4531" w:type="dxa"/>
+          </w:tcPr>
+          <w:p>
+            <w:r>
+              <w:t>test material</w:t>
+            </w:r>
           </w:p>
         </w:tc>
       </w:tr>
@@ -578,19 +530,9 @@
       <w:r>
         <w:t xml:space="preserve">3. </w:t>
       </w:r>
-      <w:proofErr w:type="spellStart"/>
-      <w:r>
-        <w:t>Safety</w:t>
-      </w:r>
-      <w:proofErr w:type="spellEnd"/>
-      <w:r>
-        <w:t xml:space="preserve"> </w:t>
-      </w:r>
-      <w:proofErr w:type="spellStart"/>
-      <w:r>
-        <w:t>rules</w:t>
-      </w:r>
-      <w:proofErr w:type="spellEnd"/>
+      <w:r>
+        <w:t>Safety rules</w:t>
+      </w:r>
     </w:p>
     <w:p>
       <w:pPr>
@@ -767,27 +709,9 @@
       <w:pPr>
         <w:spacing w:after="0"/>
       </w:pPr>
-      <w:proofErr w:type="spellStart"/>
-      <w:r>
-        <w:t>Table</w:t>
-      </w:r>
-      <w:proofErr w:type="spellEnd"/>
-      <w:r>
-        <w:t xml:space="preserve"> 2. </w:t>
-      </w:r>
-      <w:proofErr w:type="spellStart"/>
-      <w:r>
-        <w:t>Specimen</w:t>
-      </w:r>
-      <w:proofErr w:type="spellEnd"/>
-      <w:r>
-        <w:t xml:space="preserve"> </w:t>
-      </w:r>
-      <w:proofErr w:type="spellStart"/>
-      <w:r>
-        <w:t>properties</w:t>
-      </w:r>
-      <w:proofErr w:type="spellEnd"/>
+      <w:r>
+        <w:t>Table 2. Specimen properties</w:t>
+      </w:r>
     </w:p>
     <w:tbl>
       <w:tblPr>
@@ -812,7 +736,6 @@
                 <w:bCs/>
               </w:rPr>
             </w:pPr>
-            <w:proofErr w:type="spellStart"/>
             <w:r>
               <w:rPr>
                 <w:b/>
@@ -820,7 +743,6 @@
               </w:rPr>
               <w:t>Parameter</w:t>
             </w:r>
-            <w:proofErr w:type="spellEnd"/>
           </w:p>
         </w:tc>
         <w:tc>
@@ -870,19 +792,9 @@
             <w:tcW w:w="3020" w:type="dxa"/>
           </w:tcPr>
           <w:p>
-            <w:proofErr w:type="spellStart"/>
             <w:r>
-              <w:t>Initial</w:t>
+              <w:t>Initial length</w:t>
             </w:r>
-            <w:proofErr w:type="spellEnd"/>
-            <w:r>
-              <w:t xml:space="preserve"> </w:t>
-            </w:r>
-            <w:proofErr w:type="spellStart"/>
-            <w:r>
-              <w:t>length</w:t>
-            </w:r>
-            <w:proofErr w:type="spellEnd"/>
           </w:p>
         </w:tc>
         <w:tc>
@@ -912,19 +824,9 @@
             <w:tcW w:w="3020" w:type="dxa"/>
           </w:tcPr>
           <w:p>
-            <w:proofErr w:type="spellStart"/>
             <w:r>
-              <w:t>Specimen</w:t>
+              <w:t>Specimen diameter</w:t>
             </w:r>
-            <w:proofErr w:type="spellEnd"/>
-            <w:r>
-              <w:t xml:space="preserve"> </w:t>
-            </w:r>
-            <w:proofErr w:type="spellStart"/>
-            <w:r>
-              <w:t>diameter</w:t>
-            </w:r>
-            <w:proofErr w:type="spellEnd"/>
           </w:p>
         </w:tc>
         <w:tc>
@@ -955,21 +857,8 @@
           </w:tcPr>
           <w:p>
             <w:r>
-              <w:t>Cross-</w:t>
+              <w:t>Cross-sectional area</w:t>
             </w:r>
-            <w:proofErr w:type="spellStart"/>
-            <w:r>
-              <w:t>sectional</w:t>
-            </w:r>
-            <w:proofErr w:type="spellEnd"/>
-            <w:r>
-              <w:t xml:space="preserve"> </w:t>
-            </w:r>
-            <w:proofErr w:type="spellStart"/>
-            <w:r>
-              <w:t>area</w:t>
-            </w:r>
-            <w:proofErr w:type="spellEnd"/>
           </w:p>
         </w:tc>
         <w:tc>
@@ -1250,48 +1139,23 @@
         <w:pStyle w:val="Caption"/>
         <w:keepNext/>
       </w:pPr>
-      <w:proofErr w:type="spellStart"/>
-      <w:r>
-        <w:t>Table</w:t>
-      </w:r>
-      <w:proofErr w:type="spellEnd"/>
+      <w:r>
+        <w:t xml:space="preserve">Table </w:t>
+      </w:r>
+      <w:fldSimple w:instr=" SEQ Table \* ARABIC ">
+        <w:r>
+          <w:rPr>
+            <w:noProof/>
+          </w:rPr>
+          <w:t>1</w:t>
+        </w:r>
+      </w:fldSimple>
       <w:r>
         <w:t xml:space="preserve"> </w:t>
       </w:r>
       <w:r>
-        <w:fldChar w:fldCharType="begin"/>
-      </w:r>
-      <w:r>
-        <w:instrText xml:space="preserve"> SEQ Table \* ARABIC </w:instrText>
-      </w:r>
-      <w:r>
-        <w:fldChar w:fldCharType="separate"/>
-      </w:r>
-      <w:r>
-        <w:rPr>
-          <w:noProof/>
-        </w:rPr>
-        <w:t>1</w:t>
-      </w:r>
-      <w:r>
-        <w:fldChar w:fldCharType="end"/>
-      </w:r>
-      <w:r>
-        <w:t xml:space="preserve"> </w:t>
-      </w:r>
-      <w:proofErr w:type="spellStart"/>
-      <w:r>
-        <w:t>Obtained</w:t>
-      </w:r>
-      <w:proofErr w:type="spellEnd"/>
-      <w:r>
-        <w:t xml:space="preserve"> test </w:t>
-      </w:r>
-      <w:proofErr w:type="spellStart"/>
-      <w:r>
-        <w:t>results</w:t>
-      </w:r>
-      <w:proofErr w:type="spellEnd"/>
+        <w:t>Obtained test results</w:t>
+      </w:r>
     </w:p>
     <w:tbl>
       <w:tblPr>
@@ -1312,11 +1176,9 @@
             <w:tcW w:w="1812" w:type="dxa"/>
           </w:tcPr>
           <w:p>
-            <w:proofErr w:type="spellStart"/>
             <w:r>
               <w:t>Material</w:t>
             </w:r>
-            <w:proofErr w:type="spellEnd"/>
           </w:p>
         </w:tc>
         <w:tc>
@@ -1325,11 +1187,9 @@
             <w:gridSpan w:val="2"/>
           </w:tcPr>
           <w:p>
-            <w:proofErr w:type="spellStart"/>
             <w:r>
               <w:t>Material</w:t>
             </w:r>
-            <w:proofErr w:type="spellEnd"/>
           </w:p>
         </w:tc>
         <w:tc>
@@ -1338,11 +1198,9 @@
             <w:gridSpan w:val="2"/>
           </w:tcPr>
           <w:p>
-            <w:proofErr w:type="spellStart"/>
             <w:r>
               <w:t>Material</w:t>
             </w:r>
-            <w:proofErr w:type="spellEnd"/>
           </w:p>
         </w:tc>
       </w:tr>
@@ -1368,21 +1226,8 @@
             <w:tcW w:w="1812" w:type="dxa"/>
           </w:tcPr>
           <w:p>
-            <w:proofErr w:type="spellStart"/>
             <w:r>
-              <w:t>Rm</w:t>
-            </w:r>
-            <w:proofErr w:type="spellEnd"/>
-            <w:r>
-              <w:t xml:space="preserve"> [</w:t>
-            </w:r>
-            <w:proofErr w:type="spellStart"/>
-            <w:r>
-              <w:t>MPa</w:t>
-            </w:r>
-            <w:proofErr w:type="spellEnd"/>
-            <w:r>
-              <w:t>]</w:t>
+              <w:t>Rm [MPa]</w:t>
             </w:r>
           </w:p>
         </w:tc>
@@ -1767,7 +1612,21 @@
         <w:rPr>
           <w:lang w:val="en-US"/>
         </w:rPr>
-        <w:t>This mechanism enables controlled and smooth stretching of the material until fracture.</w:t>
+        <w:t xml:space="preserve">This mechanism enables controlled and smooth stretching of the material until </w:t>
+      </w:r>
+      <w:proofErr w:type="gramStart"/>
+      <w:r>
+        <w:rPr>
+          <w:lang w:val="en-US"/>
+        </w:rPr>
+        <w:t>fracture</w:t>
+      </w:r>
+      <w:proofErr w:type="gramEnd"/>
+      <w:r>
+        <w:rPr>
+          <w:lang w:val="en-US"/>
+        </w:rPr>
+        <w:t>.</w:t>
       </w:r>
     </w:p>
     <w:p>
@@ -1890,35 +1749,7 @@
         <w:rPr>
           <w:lang w:val="en-US"/>
         </w:rPr>
-        <w:t xml:space="preserve"> Example 1000 </w:t>
-      </w:r>
-      <w:proofErr w:type="spellStart"/>
-      <w:r>
-        <w:rPr>
-          <w:lang w:val="en-US"/>
-        </w:rPr>
-        <w:t>kN</w:t>
-      </w:r>
-      <w:proofErr w:type="spellEnd"/>
-      <w:r>
-        <w:rPr>
-          <w:lang w:val="en-US"/>
-        </w:rPr>
-        <w:t xml:space="preserve"> universal testing machine (</w:t>
-      </w:r>
-      <w:proofErr w:type="spellStart"/>
-      <w:r>
-        <w:rPr>
-          <w:lang w:val="en-US"/>
-        </w:rPr>
-        <w:t>LaborTech</w:t>
-      </w:r>
-      <w:proofErr w:type="spellEnd"/>
-      <w:r>
-        <w:rPr>
-          <w:lang w:val="en-US"/>
-        </w:rPr>
-        <w:t>).</w:t>
+        <w:t xml:space="preserve"> Example 1000 kN universal testing machine (LaborTech).</w:t>
       </w:r>
     </w:p>
     <w:p>
@@ -2023,7 +1854,7 @@
           <w:noProof/>
         </w:rPr>
         <w:drawing>
-          <wp:inline distT="0" distB="0" distL="0" distR="0" wp14:anchorId="260F445F" wp14:editId="39761E40">
+          <wp:inline distT="0" distB="0" distL="0" distR="0" wp14:anchorId="260F445F" wp14:editId="1A0327EF">
             <wp:extent cx="5715000" cy="990600"/>
             <wp:effectExtent l="0" t="0" r="0" b="0"/>
             <wp:docPr id="266536849" name="Obraz 3" descr="Photograph of a metallic tensile-test specimen after a static tensile test. The cylindrical specimen is shown in two separated pieces on graph paper, illustrating complete fracture. Both fractured ends are visible near the center of the image, with noticeable necking and reduction in diameter in the gauge section adjacent to the break. Darker threaded grip sections remain intact at both ends, while the central gauge length has a metallic gray appearance."/>
@@ -2076,6 +1907,9 @@
       <w:pPr>
         <w:pStyle w:val="Caption"/>
         <w:jc w:val="center"/>
+        <w:rPr>
+          <w:lang w:val="en-US"/>
+        </w:rPr>
       </w:pPr>
       <w:bookmarkStart w:id="1" w:name="_Ref234490067"/>
       <w:r>

</xml_diff>